<commit_message>
Bring the press kit up to date with ring 3 and inference
The suite grew to 176 assertions over six targets and the kernel now runs a
transformer, so the numbers and the copy in the kit were both stale. Both are
generated, which is the entire reason this is a two-line change rather than a
hunt through a document.

The thread and the Reddit post gain the aarch64 scheduler bug, which is the
best story in the set: a port that had no preemption and could not wake a
sleeping thread, for its entire life, because the tick was driven by a
hardcoded test for the x86 timer's interrupt line.
</commit_message>
<xml_diff>
--- a/media/RESENTMENT-2.0.0-social-kit.docx
+++ b/media/RESENTMENT-2.0.0-social-kit.docx
@@ -307,7 +307,7 @@
                 <w:color w:val="141820"/>
                 <w:sz w:val="19"/>
               </w:rPr>
-              <w:t>1440 host assertions + 168 through the shell under QEMU across 6 targets</w:t>
+              <w:t>1440 host assertions + 176 through the shell under QEMU across 6 targets</w:t>
             </w:r>
           </w:p>
         </w:tc>
@@ -922,7 +922,7 @@
                 <w:color w:val="141820"/>
                 <w:sz w:val="19"/>
               </w:rPr>
-              <w:t>Boots on x86_64, ARM64 and RISC-V. SMP on all three.</w:t>
+              <w:t>Boots on x86_64, ARM64 and RISC-V. SMP on all three. Loads a GGUF model and</w:t>
             </w:r>
           </w:p>
           <w:p>
@@ -935,7 +935,45 @@
                 <w:color w:val="141820"/>
                 <w:sz w:val="19"/>
               </w:rPr>
-              <w:t>1440 host assertions + 168 driven through its own shell under QEMU.</w:t>
+              <w:t>runs a real transformer forward pass through its own operators, on a thread the</w:t>
+            </w:r>
+          </w:p>
+          <w:p>
+            <w:pPr>
+              <w:spacing w:after="0" w:before="0"/>
+            </w:pPr>
+            <w:r>
+              <w:rPr>
+                <w:rFonts w:ascii="Consolas" w:hAnsi="Consolas" w:eastAsia="Consolas"/>
+                <w:color w:val="141820"/>
+                <w:sz w:val="19"/>
+              </w:rPr>
+              <w:t>deadline admission controller accepted.</w:t>
+            </w:r>
+          </w:p>
+          <w:p>
+            <w:pPr>
+              <w:spacing w:after="0" w:before="0"/>
+            </w:pPr>
+            <w:r>
+              <w:rPr>
+                <w:rFonts w:ascii="Consolas" w:hAnsi="Consolas" w:eastAsia="Consolas"/>
+                <w:color w:val="141820"/>
+                <w:sz w:val="19"/>
+              </w:rPr>
+            </w:r>
+          </w:p>
+          <w:p>
+            <w:pPr>
+              <w:spacing w:after="0" w:before="0"/>
+            </w:pPr>
+            <w:r>
+              <w:rPr>
+                <w:rFonts w:ascii="Consolas" w:hAnsi="Consolas" w:eastAsia="Consolas"/>
+                <w:color w:val="141820"/>
+                <w:sz w:val="19"/>
+              </w:rPr>
+              <w:t>1440 host assertions + 176 driven through its own shell under QEMU.</w:t>
             </w:r>
           </w:p>
           <w:p>
@@ -1773,7 +1811,7 @@
                 <w:color w:val="141820"/>
                 <w:sz w:val="19"/>
               </w:rPr>
-              <w:t>9/  And a RISC-V one that only appears under GNU ld:</w:t>
+              <w:t>9/  My actual favourite, found while making inference work:</w:t>
             </w:r>
           </w:p>
           <w:p>
@@ -1798,6 +1836,183 @@
                 <w:color w:val="141820"/>
                 <w:sz w:val="19"/>
               </w:rPr>
+              <w:t xml:space="preserve">    sched_tick() was never called on ARM64. At all. Since the port was</w:t>
+            </w:r>
+          </w:p>
+          <w:p>
+            <w:pPr>
+              <w:spacing w:after="0" w:before="0"/>
+            </w:pPr>
+            <w:r>
+              <w:rPr>
+                <w:rFonts w:ascii="Consolas" w:hAnsi="Consolas" w:eastAsia="Consolas"/>
+                <w:color w:val="141820"/>
+                <w:sz w:val="19"/>
+              </w:rPr>
+              <w:t xml:space="preserve">    written.</w:t>
+            </w:r>
+          </w:p>
+          <w:p>
+            <w:pPr>
+              <w:spacing w:after="0" w:before="0"/>
+            </w:pPr>
+            <w:r>
+              <w:rPr>
+                <w:rFonts w:ascii="Consolas" w:hAnsi="Consolas" w:eastAsia="Consolas"/>
+                <w:color w:val="141820"/>
+                <w:sz w:val="19"/>
+              </w:rPr>
+            </w:r>
+          </w:p>
+          <w:p>
+            <w:pPr>
+              <w:spacing w:after="0" w:before="0"/>
+            </w:pPr>
+            <w:r>
+              <w:rPr>
+                <w:rFonts w:ascii="Consolas" w:hAnsi="Consolas" w:eastAsia="Consolas"/>
+                <w:color w:val="141820"/>
+                <w:sz w:val="19"/>
+              </w:rPr>
+              <w:t xml:space="preserve">    It was driven by a hardcoded test for interrupt line zero — the x86</w:t>
+            </w:r>
+          </w:p>
+          <w:p>
+            <w:pPr>
+              <w:spacing w:after="0" w:before="0"/>
+            </w:pPr>
+            <w:r>
+              <w:rPr>
+                <w:rFonts w:ascii="Consolas" w:hAnsi="Consolas" w:eastAsia="Consolas"/>
+                <w:color w:val="141820"/>
+                <w:sz w:val="19"/>
+              </w:rPr>
+              <w:t xml:space="preserve">    timer and nothing else's. ARM's timer is a PPI on line 27.</w:t>
+            </w:r>
+          </w:p>
+          <w:p>
+            <w:pPr>
+              <w:spacing w:after="0" w:before="0"/>
+            </w:pPr>
+            <w:r>
+              <w:rPr>
+                <w:rFonts w:ascii="Consolas" w:hAnsi="Consolas" w:eastAsia="Consolas"/>
+                <w:color w:val="141820"/>
+                <w:sz w:val="19"/>
+              </w:rPr>
+            </w:r>
+          </w:p>
+          <w:p>
+            <w:pPr>
+              <w:spacing w:after="0" w:before="0"/>
+            </w:pPr>
+            <w:r>
+              <w:rPr>
+                <w:rFonts w:ascii="Consolas" w:hAnsi="Consolas" w:eastAsia="Consolas"/>
+                <w:color w:val="141820"/>
+                <w:sz w:val="19"/>
+              </w:rPr>
+              <w:t xml:space="preserve">    So that port had no preemption, no slice accounting, and</w:t>
+            </w:r>
+          </w:p>
+          <w:p>
+            <w:pPr>
+              <w:spacing w:after="0" w:before="0"/>
+            </w:pPr>
+            <w:r>
+              <w:rPr>
+                <w:rFonts w:ascii="Consolas" w:hAnsi="Consolas" w:eastAsia="Consolas"/>
+                <w:color w:val="141820"/>
+                <w:sz w:val="19"/>
+              </w:rPr>
+              <w:t xml:space="preserve">    sched_sleep_ms never returned, because nothing ever woke a sleeper.</w:t>
+            </w:r>
+          </w:p>
+          <w:p>
+            <w:pPr>
+              <w:spacing w:after="0" w:before="0"/>
+            </w:pPr>
+            <w:r>
+              <w:rPr>
+                <w:rFonts w:ascii="Consolas" w:hAnsi="Consolas" w:eastAsia="Consolas"/>
+                <w:color w:val="141820"/>
+                <w:sz w:val="19"/>
+              </w:rPr>
+            </w:r>
+          </w:p>
+          <w:p>
+            <w:pPr>
+              <w:spacing w:after="0" w:before="0"/>
+            </w:pPr>
+            <w:r>
+              <w:rPr>
+                <w:rFonts w:ascii="Consolas" w:hAnsi="Consolas" w:eastAsia="Consolas"/>
+                <w:color w:val="141820"/>
+                <w:sz w:val="19"/>
+              </w:rPr>
+              <w:t xml:space="preserve">    Nothing in the test suite slept. It went unnoticed for the life of</w:t>
+            </w:r>
+          </w:p>
+          <w:p>
+            <w:pPr>
+              <w:spacing w:after="0" w:before="0"/>
+            </w:pPr>
+            <w:r>
+              <w:rPr>
+                <w:rFonts w:ascii="Consolas" w:hAnsi="Consolas" w:eastAsia="Consolas"/>
+                <w:color w:val="141820"/>
+                <w:sz w:val="19"/>
+              </w:rPr>
+              <w:t xml:space="preserve">    the port.</w:t>
+            </w:r>
+          </w:p>
+          <w:p>
+            <w:pPr>
+              <w:spacing w:after="0" w:before="0"/>
+            </w:pPr>
+            <w:r>
+              <w:rPr>
+                <w:rFonts w:ascii="Consolas" w:hAnsi="Consolas" w:eastAsia="Consolas"/>
+                <w:color w:val="141820"/>
+                <w:sz w:val="19"/>
+              </w:rPr>
+            </w:r>
+          </w:p>
+          <w:p>
+            <w:pPr>
+              <w:spacing w:after="0" w:before="0"/>
+            </w:pPr>
+            <w:r>
+              <w:rPr>
+                <w:rFonts w:ascii="Consolas" w:hAnsi="Consolas" w:eastAsia="Consolas"/>
+                <w:color w:val="141820"/>
+                <w:sz w:val="19"/>
+              </w:rPr>
+              <w:t>10/ And a RISC-V one that only appears under GNU ld:</w:t>
+            </w:r>
+          </w:p>
+          <w:p>
+            <w:pPr>
+              <w:spacing w:after="0" w:before="0"/>
+            </w:pPr>
+            <w:r>
+              <w:rPr>
+                <w:rFonts w:ascii="Consolas" w:hAnsi="Consolas" w:eastAsia="Consolas"/>
+                <w:color w:val="141820"/>
+                <w:sz w:val="19"/>
+              </w:rPr>
+            </w:r>
+          </w:p>
+          <w:p>
+            <w:pPr>
+              <w:spacing w:after="0" w:before="0"/>
+            </w:pPr>
+            <w:r>
+              <w:rPr>
+                <w:rFonts w:ascii="Consolas" w:hAnsi="Consolas" w:eastAsia="Consolas"/>
+                <w:color w:val="141820"/>
+                <w:sz w:val="19"/>
+              </w:rPr>
               <w:t xml:space="preserve">    `la t0, sym` gets relaxed into `addi t0, gp, offset`. I'd put code</w:t>
             </w:r>
           </w:p>
@@ -1874,7 +2089,7 @@
                 <w:color w:val="141820"/>
                 <w:sz w:val="19"/>
               </w:rPr>
-              <w:t>10/ What I'm NOT claiming:</w:t>
+              <w:t>11/ The kernel now runs a transformer.</w:t>
             </w:r>
           </w:p>
           <w:p>
@@ -1899,7 +2114,7 @@
                 <w:color w:val="141820"/>
                 <w:sz w:val="19"/>
               </w:rPr>
-              <w:t xml:space="preserve">    Ring 3 works on x86_64 only. ARM64 and RISC-V need MMU work first, and</w:t>
+              <w:t xml:space="preserve">    Not a wrapper around one — the forward pass itself, built from the</w:t>
             </w:r>
           </w:p>
           <w:p>
@@ -1912,7 +2127,7 @@
                 <w:color w:val="141820"/>
                 <w:sz w:val="19"/>
               </w:rPr>
-              <w:t xml:space="preserve">    docs/USERSPACE.md says exactly what's left rather than implying it's</w:t>
+              <w:t xml:space="preserve">    kernel's own operators. Embed, RMSNorm, QKV, RoPE, attention over the</w:t>
             </w:r>
           </w:p>
           <w:p>
@@ -1925,7 +2140,7 @@
                 <w:color w:val="141820"/>
                 <w:sz w:val="19"/>
               </w:rPr>
-              <w:t xml:space="preserve">    nearly done.</w:t>
+              <w:t xml:space="preserve">    KV history, gated FFN, logits, argmax.</w:t>
             </w:r>
           </w:p>
           <w:p>
@@ -1950,7 +2165,7 @@
                 <w:color w:val="141820"/>
                 <w:sz w:val="19"/>
               </w:rPr>
-              <w:t xml:space="preserve">    No PCI, no network stack yet.</w:t>
+              <w:t xml:space="preserve">      resentment&gt; .infer 24</w:t>
             </w:r>
           </w:p>
           <w:p>
@@ -1963,6 +2178,7 @@
                 <w:color w:val="141820"/>
                 <w:sz w:val="19"/>
               </w:rPr>
+              <w:t xml:space="preserve">        generated  24 tokens in 130 ms</w:t>
             </w:r>
           </w:p>
           <w:p>
@@ -1975,7 +2191,7 @@
                 <w:color w:val="141820"/>
                 <w:sz w:val="19"/>
               </w:rPr>
-              <w:t>11/ Everything is verifiable:</w:t>
+              <w:t xml:space="preserve">        class      SCHED_INFERENCE, 50 Hz declared, admitted</w:t>
             </w:r>
           </w:p>
           <w:p>
@@ -1988,6 +2204,7 @@
                 <w:color w:val="141820"/>
                 <w:sz w:val="19"/>
               </w:rPr>
+              <w:t xml:space="preserve">        deadline miss  0</w:t>
             </w:r>
           </w:p>
           <w:p>
@@ -2000,6 +2217,182 @@
                 <w:color w:val="141820"/>
                 <w:sz w:val="19"/>
               </w:rPr>
+            </w:r>
+          </w:p>
+          <w:p>
+            <w:pPr>
+              <w:spacing w:after="0" w:before="0"/>
+            </w:pPr>
+            <w:r>
+              <w:rPr>
+                <w:rFonts w:ascii="Consolas" w:hAnsi="Consolas" w:eastAsia="Consolas"/>
+                <w:color w:val="141820"/>
+                <w:sz w:val="19"/>
+              </w:rPr>
+              <w:t xml:space="preserve">    "admitted" is the deadline admission controller accepting the rate.</w:t>
+            </w:r>
+          </w:p>
+          <w:p>
+            <w:pPr>
+              <w:spacing w:after="0" w:before="0"/>
+            </w:pPr>
+            <w:r>
+              <w:rPr>
+                <w:rFonts w:ascii="Consolas" w:hAnsi="Consolas" w:eastAsia="Consolas"/>
+                <w:color w:val="141820"/>
+                <w:sz w:val="19"/>
+              </w:rPr>
+              <w:t xml:space="preserve">    Ask for more than the class has left and it refuses.</w:t>
+            </w:r>
+          </w:p>
+          <w:p>
+            <w:pPr>
+              <w:spacing w:after="0" w:before="0"/>
+            </w:pPr>
+            <w:r>
+              <w:rPr>
+                <w:rFonts w:ascii="Consolas" w:hAnsi="Consolas" w:eastAsia="Consolas"/>
+                <w:color w:val="141820"/>
+                <w:sz w:val="19"/>
+              </w:rPr>
+            </w:r>
+          </w:p>
+          <w:p>
+            <w:pPr>
+              <w:spacing w:after="0" w:before="0"/>
+            </w:pPr>
+            <w:r>
+              <w:rPr>
+                <w:rFonts w:ascii="Consolas" w:hAnsi="Consolas" w:eastAsia="Consolas"/>
+                <w:color w:val="141820"/>
+                <w:sz w:val="19"/>
+              </w:rPr>
+              <w:t>12/ What I'm NOT claiming:</w:t>
+            </w:r>
+          </w:p>
+          <w:p>
+            <w:pPr>
+              <w:spacing w:after="0" w:before="0"/>
+            </w:pPr>
+            <w:r>
+              <w:rPr>
+                <w:rFonts w:ascii="Consolas" w:hAnsi="Consolas" w:eastAsia="Consolas"/>
+                <w:color w:val="141820"/>
+                <w:sz w:val="19"/>
+              </w:rPr>
+            </w:r>
+          </w:p>
+          <w:p>
+            <w:pPr>
+              <w:spacing w:after="0" w:before="0"/>
+            </w:pPr>
+            <w:r>
+              <w:rPr>
+                <w:rFonts w:ascii="Consolas" w:hAnsi="Consolas" w:eastAsia="Consolas"/>
+                <w:color w:val="141820"/>
+                <w:sz w:val="19"/>
+              </w:rPr>
+              <w:t xml:space="preserve">    The model has pseudo-random weights. The tokens mean nothing. The</w:t>
+            </w:r>
+          </w:p>
+          <w:p>
+            <w:pPr>
+              <w:spacing w:after="0" w:before="0"/>
+            </w:pPr>
+            <w:r>
+              <w:rPr>
+                <w:rFonts w:ascii="Consolas" w:hAnsi="Consolas" w:eastAsia="Consolas"/>
+                <w:color w:val="141820"/>
+                <w:sz w:val="19"/>
+              </w:rPr>
+              <w:t xml:space="preserve">    claim is that the *path* exists and is scheduled correctly — a</w:t>
+            </w:r>
+          </w:p>
+          <w:p>
+            <w:pPr>
+              <w:spacing w:after="0" w:before="0"/>
+            </w:pPr>
+            <w:r>
+              <w:rPr>
+                <w:rFonts w:ascii="Consolas" w:hAnsi="Consolas" w:eastAsia="Consolas"/>
+                <w:color w:val="141820"/>
+                <w:sz w:val="19"/>
+              </w:rPr>
+              <w:t xml:space="preserve">    systems claim, which is the only kind a kernel gets to make.</w:t>
+            </w:r>
+          </w:p>
+          <w:p>
+            <w:pPr>
+              <w:spacing w:after="0" w:before="0"/>
+            </w:pPr>
+            <w:r>
+              <w:rPr>
+                <w:rFonts w:ascii="Consolas" w:hAnsi="Consolas" w:eastAsia="Consolas"/>
+                <w:color w:val="141820"/>
+                <w:sz w:val="19"/>
+              </w:rPr>
+            </w:r>
+          </w:p>
+          <w:p>
+            <w:pPr>
+              <w:spacing w:after="0" w:before="0"/>
+            </w:pPr>
+            <w:r>
+              <w:rPr>
+                <w:rFonts w:ascii="Consolas" w:hAnsi="Consolas" w:eastAsia="Consolas"/>
+                <w:color w:val="141820"/>
+                <w:sz w:val="19"/>
+              </w:rPr>
+              <w:t xml:space="preserve">    Ring 3 works on x86_64 only. No PCI, no network stack yet.</w:t>
+            </w:r>
+          </w:p>
+          <w:p>
+            <w:pPr>
+              <w:spacing w:after="0" w:before="0"/>
+            </w:pPr>
+            <w:r>
+              <w:rPr>
+                <w:rFonts w:ascii="Consolas" w:hAnsi="Consolas" w:eastAsia="Consolas"/>
+                <w:color w:val="141820"/>
+                <w:sz w:val="19"/>
+              </w:rPr>
+            </w:r>
+          </w:p>
+          <w:p>
+            <w:pPr>
+              <w:spacing w:after="0" w:before="0"/>
+            </w:pPr>
+            <w:r>
+              <w:rPr>
+                <w:rFonts w:ascii="Consolas" w:hAnsi="Consolas" w:eastAsia="Consolas"/>
+                <w:color w:val="141820"/>
+                <w:sz w:val="19"/>
+              </w:rPr>
+              <w:t>13/ Everything is verifiable:</w:t>
+            </w:r>
+          </w:p>
+          <w:p>
+            <w:pPr>
+              <w:spacing w:after="0" w:before="0"/>
+            </w:pPr>
+            <w:r>
+              <w:rPr>
+                <w:rFonts w:ascii="Consolas" w:hAnsi="Consolas" w:eastAsia="Consolas"/>
+                <w:color w:val="141820"/>
+                <w:sz w:val="19"/>
+              </w:rPr>
+            </w:r>
+          </w:p>
+          <w:p>
+            <w:pPr>
+              <w:spacing w:after="0" w:before="0"/>
+            </w:pPr>
+            <w:r>
+              <w:rPr>
+                <w:rFonts w:ascii="Consolas" w:hAnsi="Consolas" w:eastAsia="Consolas"/>
+                <w:color w:val="141820"/>
+                <w:sz w:val="19"/>
+              </w:rPr>
               <w:t xml:space="preserve">    make test           1440 assertions on the host</w:t>
             </w:r>
           </w:p>
@@ -2013,7 +2406,7 @@
                 <w:color w:val="141820"/>
                 <w:sz w:val="19"/>
               </w:rPr>
-              <w:t xml:space="preserve">    make qemu-test-all  6 targets, 168 assertions through the shell</w:t>
+              <w:t xml:space="preserve">    make qemu-test-all  6 targets, 176 assertions through the shell</w:t>
             </w:r>
           </w:p>
           <w:p>
@@ -2232,7 +2625,7 @@
                 <w:color w:val="141820"/>
                 <w:sz w:val="20"/>
               </w:rPr>
-              <w:t>on the host plus 168 driven through its own shell under QEMU on six targets.</w:t>
+              <w:t>on the host plus 176 driven through its own shell under QEMU on six targets.</w:t>
             </w:r>
           </w:p>
           <w:p>
@@ -2513,6 +2906,96 @@
                 <w:color w:val="141820"/>
                 <w:sz w:val="20"/>
               </w:rPr>
+              <w:t>It also runs a transformer - not a wrapper around one, but the forward pass</w:t>
+            </w:r>
+          </w:p>
+          <w:p>
+            <w:pPr>
+              <w:spacing w:after="0" w:before="0"/>
+            </w:pPr>
+            <w:r>
+              <w:rPr>
+                <w:rFonts w:ascii="Segoe UI" w:hAnsi="Segoe UI" w:eastAsia="Segoe UI"/>
+                <w:color w:val="141820"/>
+                <w:sz w:val="20"/>
+              </w:rPr>
+              <w:t>itself, assembled from the kernel's own operators and scheduled by the class</w:t>
+            </w:r>
+          </w:p>
+          <w:p>
+            <w:pPr>
+              <w:spacing w:after="0" w:before="0"/>
+            </w:pPr>
+            <w:r>
+              <w:rPr>
+                <w:rFonts w:ascii="Segoe UI" w:hAnsi="Segoe UI" w:eastAsia="Segoe UI"/>
+                <w:color w:val="141820"/>
+                <w:sz w:val="20"/>
+              </w:rPr>
+              <w:t>above. The fixture model it runs has pseudo-random weights and produces</w:t>
+            </w:r>
+          </w:p>
+          <w:p>
+            <w:pPr>
+              <w:spacing w:after="0" w:before="0"/>
+            </w:pPr>
+            <w:r>
+              <w:rPr>
+                <w:rFonts w:ascii="Segoe UI" w:hAnsi="Segoe UI" w:eastAsia="Segoe UI"/>
+                <w:color w:val="141820"/>
+                <w:sz w:val="20"/>
+              </w:rPr>
+              <w:t>meaningless tokens, deliberately: the claim is that the path exists and is</w:t>
+            </w:r>
+          </w:p>
+          <w:p>
+            <w:pPr>
+              <w:spacing w:after="0" w:before="0"/>
+            </w:pPr>
+            <w:r>
+              <w:rPr>
+                <w:rFonts w:ascii="Segoe UI" w:hAnsi="Segoe UI" w:eastAsia="Segoe UI"/>
+                <w:color w:val="141820"/>
+                <w:sz w:val="20"/>
+              </w:rPr>
+              <w:t>admitted, budgeted and yielded correctly, which is a systems claim and the only</w:t>
+            </w:r>
+          </w:p>
+          <w:p>
+            <w:pPr>
+              <w:spacing w:after="0" w:before="0"/>
+            </w:pPr>
+            <w:r>
+              <w:rPr>
+                <w:rFonts w:ascii="Segoe UI" w:hAnsi="Segoe UI" w:eastAsia="Segoe UI"/>
+                <w:color w:val="141820"/>
+                <w:sz w:val="20"/>
+              </w:rPr>
+              <w:t>kind a kernel is entitled to make.</w:t>
+            </w:r>
+          </w:p>
+          <w:p>
+            <w:pPr>
+              <w:spacing w:after="0" w:before="0"/>
+            </w:pPr>
+            <w:r>
+              <w:rPr>
+                <w:rFonts w:ascii="Segoe UI" w:hAnsi="Segoe UI" w:eastAsia="Segoe UI"/>
+                <w:color w:val="141820"/>
+                <w:sz w:val="20"/>
+              </w:rPr>
+            </w:r>
+          </w:p>
+          <w:p>
+            <w:pPr>
+              <w:spacing w:after="0" w:before="0"/>
+            </w:pPr>
+            <w:r>
+              <w:rPr>
+                <w:rFonts w:ascii="Segoe UI" w:hAnsi="Segoe UI" w:eastAsia="Segoe UI"/>
+                <w:color w:val="141820"/>
+                <w:sz w:val="20"/>
+              </w:rPr>
               <w:t>What I found more valuable than any feature was what building it surfaced. The</w:t>
             </w:r>
           </w:p>
@@ -2591,7 +3074,7 @@
                 <w:color w:val="141820"/>
                 <w:sz w:val="20"/>
               </w:rPr>
-              <w:t>never reaches. Each of those passed review, passed tests, and was found only by</w:t>
+              <w:t>never reaches. And on ARM64 the scheduler tick was never called at all - it was</w:t>
             </w:r>
           </w:p>
           <w:p>
@@ -2604,7 +3087,84 @@
                 <w:color w:val="141820"/>
                 <w:sz w:val="20"/>
               </w:rPr>
-              <w:t>a second toolchain or a four-core workload.</w:t>
+              <w:t>driven by a hardcoded test for interrupt line zero, which is the x86 timer and</w:t>
+            </w:r>
+          </w:p>
+          <w:p>
+            <w:pPr>
+              <w:spacing w:after="0" w:before="0"/>
+            </w:pPr>
+            <w:r>
+              <w:rPr>
+                <w:rFonts w:ascii="Segoe UI" w:hAnsi="Segoe UI" w:eastAsia="Segoe UI"/>
+                <w:color w:val="141820"/>
+                <w:sz w:val="20"/>
+              </w:rPr>
+              <w:t>nothing else's - so that port had no preemption and no way to wake a sleeping</w:t>
+            </w:r>
+          </w:p>
+          <w:p>
+            <w:pPr>
+              <w:spacing w:after="0" w:before="0"/>
+            </w:pPr>
+            <w:r>
+              <w:rPr>
+                <w:rFonts w:ascii="Segoe UI" w:hAnsi="Segoe UI" w:eastAsia="Segoe UI"/>
+                <w:color w:val="141820"/>
+                <w:sz w:val="20"/>
+              </w:rPr>
+              <w:t>thread, for its entire life, unnoticed because nothing in the suite slept.</w:t>
+            </w:r>
+          </w:p>
+          <w:p>
+            <w:pPr>
+              <w:spacing w:after="0" w:before="0"/>
+            </w:pPr>
+            <w:r>
+              <w:rPr>
+                <w:rFonts w:ascii="Segoe UI" w:hAnsi="Segoe UI" w:eastAsia="Segoe UI"/>
+                <w:color w:val="141820"/>
+                <w:sz w:val="20"/>
+              </w:rPr>
+            </w:r>
+          </w:p>
+          <w:p>
+            <w:pPr>
+              <w:spacing w:after="0" w:before="0"/>
+            </w:pPr>
+            <w:r>
+              <w:rPr>
+                <w:rFonts w:ascii="Segoe UI" w:hAnsi="Segoe UI" w:eastAsia="Segoe UI"/>
+                <w:color w:val="141820"/>
+                <w:sz w:val="20"/>
+              </w:rPr>
+              <w:t>Each of those passed review, passed tests, and was found only by a second</w:t>
+            </w:r>
+          </w:p>
+          <w:p>
+            <w:pPr>
+              <w:spacing w:after="0" w:before="0"/>
+            </w:pPr>
+            <w:r>
+              <w:rPr>
+                <w:rFonts w:ascii="Segoe UI" w:hAnsi="Segoe UI" w:eastAsia="Segoe UI"/>
+                <w:color w:val="141820"/>
+                <w:sz w:val="20"/>
+              </w:rPr>
+              <w:t>toolchain, a four-core workload, or by building something that finally</w:t>
+            </w:r>
+          </w:p>
+          <w:p>
+            <w:pPr>
+              <w:spacing w:after="0" w:before="0"/>
+            </w:pPr>
+            <w:r>
+              <w:rPr>
+                <w:rFonts w:ascii="Segoe UI" w:hAnsi="Segoe UI" w:eastAsia="Segoe UI"/>
+                <w:color w:val="141820"/>
+                <w:sz w:val="20"/>
+              </w:rPr>
+              <w:t>exercised the path.</w:t>
             </w:r>
           </w:p>
           <w:p>
@@ -3222,6 +3782,210 @@
                 <w:color w:val="141820"/>
                 <w:sz w:val="19"/>
               </w:rPr>
+              <w:t>**It runs a transformer**</w:t>
+            </w:r>
+          </w:p>
+          <w:p>
+            <w:pPr>
+              <w:spacing w:after="0" w:before="0"/>
+            </w:pPr>
+            <w:r>
+              <w:rPr>
+                <w:rFonts w:ascii="Consolas" w:hAnsi="Consolas" w:eastAsia="Consolas"/>
+                <w:color w:val="141820"/>
+                <w:sz w:val="19"/>
+              </w:rPr>
+            </w:r>
+          </w:p>
+          <w:p>
+            <w:pPr>
+              <w:spacing w:after="0" w:before="0"/>
+            </w:pPr>
+            <w:r>
+              <w:rPr>
+                <w:rFonts w:ascii="Consolas" w:hAnsi="Consolas" w:eastAsia="Consolas"/>
+                <w:color w:val="141820"/>
+                <w:sz w:val="19"/>
+              </w:rPr>
+              <w:t>Not a wrapper around one - the forward pass itself, through the kernel's own</w:t>
+            </w:r>
+          </w:p>
+          <w:p>
+            <w:pPr>
+              <w:spacing w:after="0" w:before="0"/>
+            </w:pPr>
+            <w:r>
+              <w:rPr>
+                <w:rFonts w:ascii="Consolas" w:hAnsi="Consolas" w:eastAsia="Consolas"/>
+                <w:color w:val="141820"/>
+                <w:sz w:val="19"/>
+              </w:rPr>
+              <w:t>operators: embed, RMSNorm, QKV projections, RoPE, attention over the KV</w:t>
+            </w:r>
+          </w:p>
+          <w:p>
+            <w:pPr>
+              <w:spacing w:after="0" w:before="0"/>
+            </w:pPr>
+            <w:r>
+              <w:rPr>
+                <w:rFonts w:ascii="Consolas" w:hAnsi="Consolas" w:eastAsia="Consolas"/>
+                <w:color w:val="141820"/>
+                <w:sz w:val="19"/>
+              </w:rPr>
+              <w:t>history, gated FFN, logits, argmax. On a thread the deadline admission</w:t>
+            </w:r>
+          </w:p>
+          <w:p>
+            <w:pPr>
+              <w:spacing w:after="0" w:before="0"/>
+            </w:pPr>
+            <w:r>
+              <w:rPr>
+                <w:rFonts w:ascii="Consolas" w:hAnsi="Consolas" w:eastAsia="Consolas"/>
+                <w:color w:val="141820"/>
+                <w:sz w:val="19"/>
+              </w:rPr>
+              <w:t>controller accepted.</w:t>
+            </w:r>
+          </w:p>
+          <w:p>
+            <w:pPr>
+              <w:spacing w:after="0" w:before="0"/>
+            </w:pPr>
+            <w:r>
+              <w:rPr>
+                <w:rFonts w:ascii="Consolas" w:hAnsi="Consolas" w:eastAsia="Consolas"/>
+                <w:color w:val="141820"/>
+                <w:sz w:val="19"/>
+              </w:rPr>
+            </w:r>
+          </w:p>
+          <w:p>
+            <w:pPr>
+              <w:spacing w:after="0" w:before="0"/>
+            </w:pPr>
+            <w:r>
+              <w:rPr>
+                <w:rFonts w:ascii="Consolas" w:hAnsi="Consolas" w:eastAsia="Consolas"/>
+                <w:color w:val="141820"/>
+                <w:sz w:val="19"/>
+              </w:rPr>
+              <w:t xml:space="preserve">    resentment&gt; .infer 24</w:t>
+            </w:r>
+          </w:p>
+          <w:p>
+            <w:pPr>
+              <w:spacing w:after="0" w:before="0"/>
+            </w:pPr>
+            <w:r>
+              <w:rPr>
+                <w:rFonts w:ascii="Consolas" w:hAnsi="Consolas" w:eastAsia="Consolas"/>
+                <w:color w:val="141820"/>
+                <w:sz w:val="19"/>
+              </w:rPr>
+              <w:t xml:space="preserve">      generated      24 tokens in 130 ms</w:t>
+            </w:r>
+          </w:p>
+          <w:p>
+            <w:pPr>
+              <w:spacing w:after="0" w:before="0"/>
+            </w:pPr>
+            <w:r>
+              <w:rPr>
+                <w:rFonts w:ascii="Consolas" w:hAnsi="Consolas" w:eastAsia="Consolas"/>
+                <w:color w:val="141820"/>
+                <w:sz w:val="19"/>
+              </w:rPr>
+              <w:t xml:space="preserve">      rate           193 tokens/sec</w:t>
+            </w:r>
+          </w:p>
+          <w:p>
+            <w:pPr>
+              <w:spacing w:after="0" w:before="0"/>
+            </w:pPr>
+            <w:r>
+              <w:rPr>
+                <w:rFonts w:ascii="Consolas" w:hAnsi="Consolas" w:eastAsia="Consolas"/>
+                <w:color w:val="141820"/>
+                <w:sz w:val="19"/>
+              </w:rPr>
+              <w:t xml:space="preserve">      class          SCHED_INFERENCE, 50 Hz declared, 5000 us budget, admitted</w:t>
+            </w:r>
+          </w:p>
+          <w:p>
+            <w:pPr>
+              <w:spacing w:after="0" w:before="0"/>
+            </w:pPr>
+            <w:r>
+              <w:rPr>
+                <w:rFonts w:ascii="Consolas" w:hAnsi="Consolas" w:eastAsia="Consolas"/>
+                <w:color w:val="141820"/>
+                <w:sz w:val="19"/>
+              </w:rPr>
+              <w:t xml:space="preserve">      deadline miss  0</w:t>
+            </w:r>
+          </w:p>
+          <w:p>
+            <w:pPr>
+              <w:spacing w:after="0" w:before="0"/>
+            </w:pPr>
+            <w:r>
+              <w:rPr>
+                <w:rFonts w:ascii="Consolas" w:hAnsi="Consolas" w:eastAsia="Consolas"/>
+                <w:color w:val="141820"/>
+                <w:sz w:val="19"/>
+              </w:rPr>
+            </w:r>
+          </w:p>
+          <w:p>
+            <w:pPr>
+              <w:spacing w:after="0" w:before="0"/>
+            </w:pPr>
+            <w:r>
+              <w:rPr>
+                <w:rFonts w:ascii="Consolas" w:hAnsi="Consolas" w:eastAsia="Consolas"/>
+                <w:color w:val="141820"/>
+                <w:sz w:val="19"/>
+              </w:rPr>
+              <w:t>The fixture model has pseudo-random weights and the tokens are meaningless by</w:t>
+            </w:r>
+          </w:p>
+          <w:p>
+            <w:pPr>
+              <w:spacing w:after="0" w:before="0"/>
+            </w:pPr>
+            <w:r>
+              <w:rPr>
+                <w:rFonts w:ascii="Consolas" w:hAnsi="Consolas" w:eastAsia="Consolas"/>
+                <w:color w:val="141820"/>
+                <w:sz w:val="19"/>
+              </w:rPr>
+              <w:t>construction. The claim is about the path, not the output.</w:t>
+            </w:r>
+          </w:p>
+          <w:p>
+            <w:pPr>
+              <w:spacing w:after="0" w:before="0"/>
+            </w:pPr>
+            <w:r>
+              <w:rPr>
+                <w:rFonts w:ascii="Consolas" w:hAnsi="Consolas" w:eastAsia="Consolas"/>
+                <w:color w:val="141820"/>
+                <w:sz w:val="19"/>
+              </w:rPr>
+            </w:r>
+          </w:p>
+          <w:p>
+            <w:pPr>
+              <w:spacing w:after="0" w:before="0"/>
+            </w:pPr>
+            <w:r>
+              <w:rPr>
+                <w:rFonts w:ascii="Consolas" w:hAnsi="Consolas" w:eastAsia="Consolas"/>
+                <w:color w:val="141820"/>
+                <w:sz w:val="19"/>
+              </w:rPr>
               <w:t>**Status, honestly**</w:t>
             </w:r>
           </w:p>
@@ -3594,6 +4358,71 @@
                 <w:sz w:val="19"/>
               </w:rPr>
               <w:t xml:space="preserve">  LLD, fatal on hardware.</w:t>
+            </w:r>
+          </w:p>
+          <w:p>
+            <w:pPr>
+              <w:spacing w:after="0" w:before="0"/>
+            </w:pPr>
+            <w:r>
+              <w:rPr>
+                <w:rFonts w:ascii="Consolas" w:hAnsi="Consolas" w:eastAsia="Consolas"/>
+                <w:color w:val="141820"/>
+                <w:sz w:val="19"/>
+              </w:rPr>
+              <w:t>- **`sched_tick()` was never called on ARM64.** It was driven by a hardcoded</w:t>
+            </w:r>
+          </w:p>
+          <w:p>
+            <w:pPr>
+              <w:spacing w:after="0" w:before="0"/>
+            </w:pPr>
+            <w:r>
+              <w:rPr>
+                <w:rFonts w:ascii="Consolas" w:hAnsi="Consolas" w:eastAsia="Consolas"/>
+                <w:color w:val="141820"/>
+                <w:sz w:val="19"/>
+              </w:rPr>
+              <w:t xml:space="preserve">  test for interrupt line zero, which is the x86 timer and nothing else's.</w:t>
+            </w:r>
+          </w:p>
+          <w:p>
+            <w:pPr>
+              <w:spacing w:after="0" w:before="0"/>
+            </w:pPr>
+            <w:r>
+              <w:rPr>
+                <w:rFonts w:ascii="Consolas" w:hAnsi="Consolas" w:eastAsia="Consolas"/>
+                <w:color w:val="141820"/>
+                <w:sz w:val="19"/>
+              </w:rPr>
+              <w:t xml:space="preserve">  ARM's is a PPI on line 27. That port had no preemption, no slice accounting,</w:t>
+            </w:r>
+          </w:p>
+          <w:p>
+            <w:pPr>
+              <w:spacing w:after="0" w:before="0"/>
+            </w:pPr>
+            <w:r>
+              <w:rPr>
+                <w:rFonts w:ascii="Consolas" w:hAnsi="Consolas" w:eastAsia="Consolas"/>
+                <w:color w:val="141820"/>
+                <w:sz w:val="19"/>
+              </w:rPr>
+              <w:t xml:space="preserve">  and `sched_sleep_ms` never returned. Nothing in the suite slept, so it went</w:t>
+            </w:r>
+          </w:p>
+          <w:p>
+            <w:pPr>
+              <w:spacing w:after="0" w:before="0"/>
+            </w:pPr>
+            <w:r>
+              <w:rPr>
+                <w:rFonts w:ascii="Consolas" w:hAnsi="Consolas" w:eastAsia="Consolas"/>
+                <w:color w:val="141820"/>
+                <w:sz w:val="19"/>
+              </w:rPr>
+              <w:t xml:space="preserve">  unnoticed for the life of the port.</w:t>
             </w:r>
           </w:p>
           <w:p>
@@ -4357,7 +5186,7 @@
                 <w:color w:val="141820"/>
                 <w:sz w:val="19"/>
               </w:rPr>
-              <w:t>x86_64 + ARM64 + RISC-V, SMP on all three, 1440 + 168 tests, zero dependencies.</w:t>
+              <w:t>x86_64 + ARM64 + RISC-V, SMP on all three, 1440 + 176 tests, zero dependencies.</w:t>
             </w:r>
           </w:p>
           <w:p>
@@ -5230,7 +6059,7 @@
                 <w:color w:val="555D6B"/>
                 <w:sz w:val="19"/>
               </w:rPr>
-              <w:t>Scheduling classes</w:t>
+              <w:t>Inference</w:t>
             </w:r>
           </w:p>
         </w:tc>
@@ -5249,7 +6078,7 @@
                 <w:color w:val="141820"/>
                 <w:sz w:val="19"/>
               </w:rPr>
-              <w:t>4 — realtime, inference, interactive, batch</w:t>
+              <w:t>all three - a real transformer forward pass, admitted by deadline admission control</w:t>
             </w:r>
           </w:p>
         </w:tc>
@@ -5270,7 +6099,7 @@
                 <w:color w:val="555D6B"/>
                 <w:sz w:val="19"/>
               </w:rPr>
-              <w:t>Capability types</w:t>
+              <w:t>Scheduling classes</w:t>
             </w:r>
           </w:p>
         </w:tc>
@@ -5289,7 +6118,7 @@
                 <w:color w:val="141820"/>
                 <w:sz w:val="19"/>
               </w:rPr>
-              <w:t>24, each sealed and time-bounded</w:t>
+              <w:t>4 — realtime, inference, interactive, batch</w:t>
             </w:r>
           </w:p>
         </w:tc>
@@ -5310,7 +6139,7 @@
                 <w:color w:val="555D6B"/>
                 <w:sz w:val="19"/>
               </w:rPr>
-              <w:t>SHE builtins</w:t>
+              <w:t>Capability types</w:t>
             </w:r>
           </w:p>
         </w:tc>
@@ -5329,7 +6158,7 @@
                 <w:color w:val="141820"/>
                 <w:sz w:val="19"/>
               </w:rPr>
-              <w:t>29, behind 11 permission grants</w:t>
+              <w:t>24, each sealed and time-bounded</w:t>
             </w:r>
           </w:p>
         </w:tc>
@@ -5350,7 +6179,7 @@
                 <w:color w:val="555D6B"/>
                 <w:sz w:val="19"/>
               </w:rPr>
-              <w:t>Host assertions</w:t>
+              <w:t>SHE builtins</w:t>
             </w:r>
           </w:p>
         </w:tc>
@@ -5369,7 +6198,7 @@
                 <w:color w:val="141820"/>
                 <w:sz w:val="19"/>
               </w:rPr>
-              <w:t>1440 (make test)</w:t>
+              <w:t>29, behind 11 permission grants</w:t>
             </w:r>
           </w:p>
         </w:tc>
@@ -5390,7 +6219,7 @@
                 <w:color w:val="555D6B"/>
                 <w:sz w:val="19"/>
               </w:rPr>
-              <w:t>QEMU assertions</w:t>
+              <w:t>Host assertions</w:t>
             </w:r>
           </w:p>
         </w:tc>
@@ -5409,7 +6238,47 @@
                 <w:color w:val="141820"/>
                 <w:sz w:val="19"/>
               </w:rPr>
-              <w:t>168 across 6 targets (make qemu-test-all)</w:t>
+              <w:t>1440 (make test)</w:t>
+            </w:r>
+          </w:p>
+        </w:tc>
+      </w:tr>
+      <w:tr>
+        <w:tc>
+          <w:tcPr>
+            <w:tcW w:type="dxa" w:w="3312"/>
+          </w:tcPr>
+          <w:p>
+            <w:pPr>
+              <w:spacing w:after="40" w:before="40"/>
+            </w:pPr>
+            <w:r>
+              <w:rPr>
+                <w:rFonts w:ascii="Segoe UI" w:hAnsi="Segoe UI"/>
+                <w:b/>
+                <w:color w:val="555D6B"/>
+                <w:sz w:val="19"/>
+              </w:rPr>
+              <w:t>QEMU assertions</w:t>
+            </w:r>
+          </w:p>
+        </w:tc>
+        <w:tc>
+          <w:tcPr>
+            <w:tcW w:type="dxa" w:w="6048"/>
+          </w:tcPr>
+          <w:p>
+            <w:pPr>
+              <w:spacing w:after="40" w:before="40"/>
+            </w:pPr>
+            <w:r>
+              <w:rPr>
+                <w:rFonts w:ascii="Segoe UI" w:hAnsi="Segoe UI"/>
+                <w:b w:val="0"/>
+                <w:color w:val="141820"/>
+                <w:sz w:val="19"/>
+              </w:rPr>
+              <w:t>176 across 6 targets (make qemu-test-all)</w:t>
             </w:r>
           </w:p>
         </w:tc>

</xml_diff>